<commit_message>
Add GitHub repository link to paper
</commit_message>
<xml_diff>
--- a/paper/research_paper.docx
+++ b/paper/research_paper.docx
@@ -2159,6 +2159,14 @@
     <w:p>
       <w:r>
         <w:rPr>
+          <w:b/>
+        </w:rPr>
+        <w:t>Code &amp; Data Repository: https://github.com/sudo-adi/llm-research-work</w:t>
+      </w:r>
+    </w:p>
+    <w:p>
+      <w:r>
+        <w:rPr>
           <w:i/>
         </w:rPr>
         <w:t>Manuscript prepared as part of a college-level research project on prompt engineering efficiency in large language models.</w:t>

</xml_diff>